<commit_message>
Data pipeline verified: URL-artefact fix, dataset README, executed 00_datasets notebook, MSE1 run log
- make data: 4.1 min, byte-identical across reruns, cross-split overlap 0, (Reuters) count 0
- artefact-only classifier on raw ISOT = 0.9959 (leakage evidence, in docs/mse1_make_data.log)
- WELFake label polarity corrected (0=real, 1=fake); processed counts WELFake 60,847 / ISOT 37,608
- make test: 27 passed; make paper wired to paper/Makefile (tectonic)
- master + MSE1 docs corrected for actual counts/schema; docx regenerated

Co-Authored-By: Claude Fable 5 <noreply@anthropic.com>
Claude-Session: https://claude.ai/code/session_01Hueq61qLiRBvh5qjvapUD5
</commit_message>
<xml_diff>
--- a/docs/milestones/MSE1_ProjectDetails.docx
+++ b/docs/milestones/MSE1_ProjectDetails.docx
@@ -3887,7 +3887,19 @@
         <w:t xml:space="preserve"> </w:t>
       </w:r>
       <w:r>
-        <w:t xml:space="preserve">on the processed ISOT text returns 0; the artefact-only classifier’s ISOT accuracy is reported (expected: very high, ≥ 0.9).</w:t>
+        <w:t xml:space="preserve">on the processed ISOT text returns 0; the artefact-only classifier’s ISOT accuracy is reported (expected: very high, ≥ 0.9 — measured 0.996 on 2026-08-28, logged in</w:t>
+      </w:r>
+      <w:r>
+        <w:t xml:space="preserve"> </w:t>
+      </w:r>
+      <w:r>
+        <w:rPr>
+          <w:rStyle w:val="VerbatimChar"/>
+        </w:rPr>
+        <w:t xml:space="preserve">docs/mse1_make_data.log</w:t>
+      </w:r>
+      <w:r>
+        <w:t xml:space="preserve">).</w:t>
       </w:r>
     </w:p>
     <w:p>
@@ -4153,7 +4165,7 @@
         <w:rPr>
           <w:rStyle w:val="CommentTok"/>
         </w:rPr>
-        <w:t xml:space="preserve"># ≈ 57.7k</w:t>
+        <w:t xml:space="preserve"># 48,677 = 80% of the 60,847 de-duplicated rows</w:t>
       </w:r>
     </w:p>
     <w:p>

</xml_diff>